<commit_message>
docs(presentacion): menos texto en las primeras diapositivas y sin encuadre de cambios
Las cuatro diapositivas de apertura pasan a renglones cortos; el detalle se
queda en lo que se dice, no en la pantalla. La tercera deja de titularse por
lo que cambio durante la tesis y se plantea como el estado del oficio hoy.
Salida alterna con SALIDA_PPTX para regenerar con el archivo abierto.

Co-Authored-By: Claude Opus 5 (1M context) <noreply@anthropic.com>
</commit_message>
<xml_diff>
--- a/presentacion/guion_video_v3.docx
+++ b/presentacion/guion_video_v3.docx
@@ -257,7 +257,7 @@
         <w:rPr>
           <w:i/>
         </w:rPr>
-        <w:t>En pantalla: Un Ayuntamiento recibe cotizaciones que no puede comparar y no sabe si / Un proveedor sabe programar, pero no sabe cuánto cobrar: si cobra caro / En 120 proyectos reales de 42 organizaciones, 8 de cada 10 costaron má / De 4,329 tareas estimadas por expertos, solo 4 de cada 10 cayeron dent</w:t>
+        <w:t>En pantalla: El Ayuntamiento recibe cotizaciones que no puede comparar. / El proveedor no sabe cuánto cobrar: caro pierde el contrato, barato se / 8 de cada 10 proyectos costaron más de lo estimado (120 proyectos, SEE / Solo 4 de cada 10 estimaciones de expertos quedaron cerca de lo real (</w:t>
       </w:r>
     </w:p>
     <w:p>
@@ -275,7 +275,7 @@
         <w:pStyle w:val="Heading3"/>
       </w:pPr>
       <w:r>
-        <w:t>3. Lo que cambió mientras hacía la tesis</w:t>
+        <w:t>3. Hoy el software no se hace como antes</w:t>
       </w:r>
     </w:p>
     <w:p>
@@ -283,17 +283,17 @@
         <w:rPr>
           <w:i/>
         </w:rPr>
-        <w:t>En pantalla: Uso de inteligencia artificial para programar: 62 % de los desarrollad / 90 % ya usa agentes de código cada semana y 68 % todos los días (JetBr / 41 % del código nuevo se reporta como generado con inteligencia artifi / El mercado de agentes de código para empresas vale diez mil millones d / Un modelo de estimación que asume que las horas de programación son el</w:t>
+        <w:t>En pantalla: 84 % de los desarrolladores usa inteligencia artificial para programar / 90 % usa agentes de código cada semana (JetBrains, 2026). / 41 % del código nuevo se genera con inteligencia artificial (GitHub, 2 / Estimar solo horas de programación ya no alcanza. Por eso el sistema c</w:t>
       </w:r>
     </w:p>
     <w:p>
       <w:r>
-        <w:t>Dura aproximadamente 0.9 minutos.</w:t>
+        <w:t>Dura aproximadamente 1.0 minutos.</w:t>
       </w:r>
     </w:p>
     <w:p>
       <w:r>
-        <w:t>Cuando empecé la tesis, la pregunta era cuántas horas de programación lleva un sistema. Pero en este año y medio la forma de hacer software cambió mes con mes. En 2024, seis de cada diez desarrolladores usaban inteligencia artificial. En 2025, casi ocho. En 2026, más de ocho. Y lo nuevo no es que la computadora complete una línea, sino que un agente hace la tarea completa: nueve de cada diez profesionales ya usan agentes cada semana. GitHub dice que cuarenta y uno por ciento del código nuevo se genera con inteligencia artificial. Esto ya es un mercado de diez mil millones de dólares. Para la tesis significa algo muy concreto: si mi modelo asumía que las horas de programación eran el centro del costo, ese modelo nació viejo. Había que cambiarlo.</w:t>
+        <w:t>La pregunta de siempre en esta área es cuántas horas de programación lleva un sistema. El asunto es que la forma de hacer software está cambiando mes con mes. En 2024, seis de cada diez desarrolladores usaban inteligencia artificial. En 2025, casi ocho. En 2026, más de ocho. Y lo nuevo no es que la computadora complete una línea, sino que un agente hace la tarea completa: nueve de cada diez profesionales ya usan agentes cada semana. GitHub dice que cuarenta y uno por ciento del código nuevo se genera con inteligencia artificial. Esto ya es un mercado de diez mil millones de dólares. Para la tesis significa algo muy concreto: un modelo que asuma que las horas de programación son el centro del costo se queda corto. Por eso desde el diseño el sistema calcula con cinco formas de hacerlo, no con una sola.</w:t>
       </w:r>
     </w:p>
     <w:p>
@@ -309,7 +309,7 @@
         <w:rPr>
           <w:i/>
         </w:rPr>
-        <w:t>En pantalla: Desarrolladores experimentados, trabajando en su propio código con int / En 623 millones de cambios de código, la duplicación subió 81 % y la r / 45 % del código generado por inteligencia artificial trae una falla de / Los cambios hechos con inteligencia artificial se aceptan en 30 días s / La ganancia depende de la forma de hacerlo y de la pericia de quien us</w:t>
+        <w:t>En pantalla: Expertos en su propio código tardaron 19 % más y creían ir 20 % más rá / Se copia 81 % más código y se limpia 70 % menos (GitClear, 623 millone / 45 % del código generado trae una falla de seguridad (Veracode, 2026). / La ganancia depende de la forma de hacerlo y de la pericia del equipo.</w:t>
       </w:r>
     </w:p>
     <w:p>
@@ -335,7 +335,7 @@
         <w:rPr>
           <w:i/>
         </w:rPr>
-        <w:t>En pantalla: Antes, el ajuste chico (que este texto no se ve bien, que este campo d / En 3,400 repositorios, adoptar inteligencia artificial subió 19 % los  / En una empresa con 802 desarrolladores, el rendimiento por persona lle / De 8,106 correcciones hechas por agentes, 65 % se aceptaron (arXiv, en / Quien sigue cobrando cada detalle como un día de trabajo se va a queda</w:t>
+        <w:t>En pantalla: El ajuste chico antes era un ticket y una espera. Hoy se resuelve en l / Los cambios terminados suben 19 % y cada persona ahorra de 2 a 4 horas / De 8,106 correcciones hechas por agentes, 65 % se aceptaron (arXiv, 20 / Quien sigue cobrando cada detalle como un día de trabajo se va a queda</w:t>
       </w:r>
     </w:p>
     <w:p>
@@ -449,7 +449,7 @@
     </w:p>
     <w:p>
       <w:r>
-        <w:t>Resumo lo que dicen los datos. Primero: con las variables que se conocen al inicio del proyecto, un modelo estadístico que se llama bosque aleatorio explicó ochenta y uno por ciento de la variación del esfuerzo en los proyectos completos. El promedio, que es lo que se usa normalmente, explicó cero. Eso respalda la tercera hipótesis. Segundo: el experto ordena pero no dimensiona; eso respalda la primera. Tercero: la segunda hipótesis no se confirmó: buscar cambios por palabras en el texto de la tarea no distingue nada. Y eso cambió el sistema: los cambios se capturan de forma estructurada, con su tipo y su fase, no se adivinan. Todo esto lo verificó un programa aparte, veintiséis de veintiséis comprobaciones.</w:t>
+        <w:t>Resumo lo que dicen los datos. Primero: con las variables que se conocen al inicio del proyecto, un modelo estadístico que se llama bosque aleatorio explicó ochenta y uno por ciento de la variación del esfuerzo en los proyectos completos. El promedio, que es lo que se usa normalmente, explicó cero. Eso respalda la tercera hipótesis. Segundo: el experto ordena pero no dimensiona; eso respalda la primera. Tercero: la segunda hipótesis no se confirmó: buscar cambios por palabras en el texto de la tarea no distingue nada. Por eso el sistema captura los cambios de forma estructurada, con su tipo y su fase, en lugar de adivinarlos del texto. Todo esto lo verificó un programa aparte, veintiséis de veintiséis comprobaciones.</w:t>
       </w:r>
     </w:p>
     <w:p>
@@ -631,7 +631,7 @@
     </w:p>
     <w:p>
       <w:r>
-        <w:t>Aquí está lo nuevo de este mes, y sale de una investigación de precios que hice el nueve de septiembre con las páginas oficiales. Las herramientas se cobran por persona, no por equipo, porque así las venden: un asiento por cada persona técnica. Y como en la vida real cada quien trae su plan, hay tres niveles: básico, típico y máximo. Por ejemplo, para casi todo con inteligencia artificial, cien, doscientos cincuenta o cuatrocientos dólares por persona al mes. Se elige por proyecto, y además cada persona puede traer su propio plan.</w:t>
+        <w:t>Esta parte sale de una investigación de precios que hice el nueve de septiembre con las páginas oficiales de cada herramienta. Las herramientas se cobran por persona, no por equipo, porque así las venden: un asiento por cada persona técnica. Y como en la vida real cada quien trae su plan, hay tres niveles: básico, típico y máximo. Por ejemplo, para casi todo con inteligencia artificial, cien, doscientos cincuenta o cuatrocientos dólares por persona al mes. Se elige por proyecto, y además cada persona puede traer su propio plan.</w:t>
       </w:r>
     </w:p>
     <w:p>

</xml_diff>

<commit_message>
docs(presentacion): el escudo de la UAZ ya va en la portada
Se saca del articulo del propio alumno (word/media/image1.jpg) y se guarda como
presentacion/capturas/escudo_uaz.png. La portada lo coloca centrado y con su
proporcion; si el archivo faltara, se dibuja el recuadro como antes. Se retira
el recordatorio de pegarlo a mano.

Co-Authored-By: Claude Opus 5 (1M context) <noreply@anthropic.com>
</commit_message>
<xml_diff>
--- a/presentacion/guion_video_v3.docx
+++ b/presentacion/guion_video_v3.docx
@@ -231,7 +231,7 @@
         <w:rPr>
           <w:i/>
         </w:rPr>
-        <w:t>En pantalla: portada con tus datos. Antes de grabar, pon el escudo de la UAZ en el recuadro.</w:t>
+        <w:t>En pantalla: portada con el escudo de la UAZ y tus datos.</w:t>
       </w:r>
     </w:p>
     <w:p>
@@ -1076,14 +1076,6 @@
         <w:pStyle w:val="ListBullet"/>
       </w:pPr>
       <w:r>
-        <w:t>Colocar el escudo de la UAZ en el recuadro de la portada.</w:t>
-      </w:r>
-    </w:p>
-    <w:p>
-      <w:pPr>
-        <w:pStyle w:val="ListBullet"/>
-      </w:pPr>
-      <w:r>
         <w:t>Tener abierto estimacion.hazlatarea.com en otra ventana para mostrar el sistema en vivo en las diapositivas 10 a 25.</w:t>
       </w:r>
     </w:p>

</xml_diff>

<commit_message>
docs(presentacion): guion mas facil de leer, una frase por renglon y sin palabras tecnicas
Notas alineadas con las diapositivas recortadas; se explican correlacion y
pericia en la misma frase; glosario solo con lo que de verdad se dice; el Word
abre con como usarlo y cada frase va en su renglon para leer mientras se graba.

Co-Authored-By: Claude Fable 5.1 <noreply@anthropic.com>
</commit_message>
<xml_diff>
--- a/presentacion/guion_video_v3.docx
+++ b/presentacion/guion_video_v3.docx
@@ -20,6 +20,46 @@
         <w:pStyle w:val="Heading2"/>
       </w:pPr>
       <w:r>
+        <w:t>Cómo usar este guion</w:t>
+      </w:r>
+    </w:p>
+    <w:p>
+      <w:pPr>
+        <w:pStyle w:val="ListBullet"/>
+      </w:pPr>
+      <w:r>
+        <w:t>No hay que aprenderlo de memoria. Lee cada renglón como si lo contaras; cada renglón es una idea.</w:t>
+      </w:r>
+    </w:p>
+    <w:p>
+      <w:pPr>
+        <w:pStyle w:val="ListBullet"/>
+      </w:pPr>
+      <w:r>
+        <w:t>Lo que está en cursiva es lo que se ve en la pantalla en ese momento. Lo demás es lo que dices.</w:t>
+      </w:r>
+    </w:p>
+    <w:p>
+      <w:pPr>
+        <w:pStyle w:val="ListBullet"/>
+      </w:pPr>
+      <w:r>
+        <w:t>Si te trabas, salta al siguiente renglón. Los números importantes también están en la diapositiva.</w:t>
+      </w:r>
+    </w:p>
+    <w:p>
+      <w:pPr>
+        <w:pStyle w:val="ListBullet"/>
+      </w:pPr>
+      <w:r>
+        <w:t>Las mismas palabras están en las notas de cada diapositiva de PowerPoint, por si grabas con la vista del presentador.</w:t>
+      </w:r>
+    </w:p>
+    <w:p>
+      <w:pPr>
+        <w:pStyle w:val="Heading2"/>
+      </w:pPr>
+      <w:r>
         <w:t>La tesis en diez renglones</w:t>
       </w:r>
     </w:p>
@@ -44,7 +84,7 @@
         <w:pStyle w:val="ListNumber"/>
       </w:pPr>
       <w:r>
-        <w:t>Mientras hacía la tesis, la inteligencia artificial cambió la forma de hacer software: hoy casi todos la usan y muchos usan agentes que hacen la tarea completa.</w:t>
+        <w:t>Hoy casi todos los desarrolladores usan inteligencia artificial y muchos usan agentes que hacen la tarea completa. Eso cambia lo que cuesta un sistema.</w:t>
       </w:r>
     </w:p>
     <w:p>
@@ -68,7 +108,7 @@
         <w:pStyle w:val="ListNumber"/>
       </w:pPr>
       <w:r>
-        <w:t>El sistema cobra las herramientas de inteligencia artificial por persona, acredita el ahorro según la pericia, suma la nómina con sus impuestos y muestra el flujo de dinero mes a mes.</w:t>
+        <w:t>El sistema cobra las herramientas de inteligencia artificial por persona, reconoce el ahorro según qué tan bien la usa el equipo, suma la nómina con sus impuestos y muestra el flujo de dinero mes a mes.</w:t>
       </w:r>
     </w:p>
     <w:p>
@@ -92,7 +132,7 @@
         <w:pStyle w:val="ListNumber"/>
       </w:pPr>
       <w:r>
-        <w:t>Lo que sigue es un piloto en dos olas, ayuntamientos y luego desarrolladores, con una encuesta de cuatro preguntas y métricas que el sistema mide solo.</w:t>
+        <w:t>Lo que sigue es un piloto en dos olas, ayuntamientos y luego desarrolladores, con una encuesta de cuatro preguntas y medidas que el sistema toma solo.</w:t>
       </w:r>
     </w:p>
     <w:p>
@@ -171,10 +211,10 @@
         <w:rPr>
           <w:b/>
         </w:rPr>
-        <w:t xml:space="preserve">MdMRE. </w:t>
-      </w:r>
-      <w:r>
-        <w:t>Error mediano: si en la mitad de los casos el error fue menor a 33 %, el MdMRE es 0.33. Es la medida clásica para decir qué tan lejos queda una estimación del valor real.</w:t>
+        <w:t xml:space="preserve">Dentro de más o menos 15 %. </w:t>
+      </w:r>
+      <w:r>
+        <w:t>Que la estimación quedó cerca del valor real: ni 15 % arriba ni 15 % abajo. Cuatro de cada diez quiere decir que solo cuatro estimaciones de cada diez estuvieron así de cerca.</w:t>
       </w:r>
     </w:p>
     <w:p>
@@ -182,10 +222,10 @@
         <w:rPr>
           <w:b/>
         </w:rPr>
-        <w:t xml:space="preserve">PRED(15). </w:t>
-      </w:r>
-      <w:r>
-        <w:t>Qué parte de las estimaciones cayó dentro de más o menos 15 % del valor real. Cuarenta por ciento quiere decir que cuatro de cada diez estuvieron cerca.</w:t>
+        <w:t xml:space="preserve">Correlación. </w:t>
+      </w:r>
+      <w:r>
+        <w:t>Qué tanto suben juntas dos cosas. Aquí, si el experto dice que una tarea es grande, de verdad es grande. Va de cero a uno; 0.79 es alta.</w:t>
       </w:r>
     </w:p>
     <w:p>
@@ -240,8 +280,51 @@
       </w:r>
     </w:p>
     <w:p>
-      <w:r>
-        <w:t>Buenas tardes. Me llamo Rogelio Flores Rodríguez y estudio Ingeniería en Software en la Universidad Autónoma de Zacatecas. Esta es la presentación de avance de mi tesis para el Seminario de Tesis, con la dirección de la doctora Julieta Guadalupe Rodríguez Ruiz. Mi tesis es sobre cómo calcular desde el principio cuánto va a costar y cuánto va a tardar un sistema de software para un municipio. Hice un sistema que ya funciona en internet y se los voy a enseñar. Voy a hablar de tres cosas: primero, cuál es el problema y cómo cambió con la inteligencia artificial; segundo, qué probé ya con datos; y tercero, cómo lo voy a probar con ayuntamientos y con desarrolladores en lo que queda del semestre.</w:t>
+      <w:pPr>
+        <w:spacing w:after="80"/>
+      </w:pPr>
+      <w:r>
+        <w:t>Buenas tardes.</w:t>
+      </w:r>
+    </w:p>
+    <w:p>
+      <w:pPr>
+        <w:spacing w:after="80"/>
+      </w:pPr>
+      <w:r>
+        <w:t>Me llamo Rogelio Flores Rodríguez y estudio Ingeniería en Software en la Universidad Autónoma de Zacatecas.</w:t>
+      </w:r>
+    </w:p>
+    <w:p>
+      <w:pPr>
+        <w:spacing w:after="80"/>
+      </w:pPr>
+      <w:r>
+        <w:t>Esta es la presentación de avance de mi tesis para el Seminario de Tesis, con la dirección de la doctora Julieta Guadalupe Rodríguez Ruiz.</w:t>
+      </w:r>
+    </w:p>
+    <w:p>
+      <w:pPr>
+        <w:spacing w:after="80"/>
+      </w:pPr>
+      <w:r>
+        <w:t>Mi tesis es sobre cómo calcular desde el principio cuánto va a costar y cuánto va a tardar un sistema de software para un municipio.</w:t>
+      </w:r>
+    </w:p>
+    <w:p>
+      <w:pPr>
+        <w:spacing w:after="80"/>
+      </w:pPr>
+      <w:r>
+        <w:t>Hice un sistema que ya funciona en internet y se los voy a enseñar.</w:t>
+      </w:r>
+    </w:p>
+    <w:p>
+      <w:pPr>
+        <w:spacing w:after="80"/>
+      </w:pPr>
+      <w:r>
+        <w:t>Voy a hablar de tres cosas: primero, cuál es el problema y cómo cambió con la inteligencia artificial; segundo, qué probé ya con datos; y tercero, cómo lo voy a probar con ayuntamientos y con desarrolladores en lo que queda del semestre.</w:t>
       </w:r>
     </w:p>
     <w:p>
@@ -266,8 +349,91 @@
       </w:r>
     </w:p>
     <w:p>
-      <w:r>
-        <w:t>El problema tiene dos lados. De un lado está el Ayuntamiento: una oficina de Catastro o de Tesorería necesita un sistema, recibe varias cotizaciones y no tiene con qué compararlas. Tampoco sabe si el que cotizó más barato va a poder terminar. Del otro lado está el proveedor, que muchas veces es una persona o una empresa de tres o cuatro. Sabe programar, pero no sabe cuánto cobrar. Si cobra caro, pierde el contrato. Si cobra barato, se queda sin dinero a la mitad y no termina. Y esto no es una impresión mía. En un conjunto de ciento veinte proyectos reales, ocho de cada diez costaron más de lo que se había estimado. Y de más de cuatro mil tareas estimadas por expertos, solo cuatro de cada diez quedaron cerca del valor real. Estimar mal es lo normal, no la excepción.</w:t>
+      <w:pPr>
+        <w:spacing w:after="80"/>
+      </w:pPr>
+      <w:r>
+        <w:t>El problema tiene dos lados.</w:t>
+      </w:r>
+    </w:p>
+    <w:p>
+      <w:pPr>
+        <w:spacing w:after="80"/>
+      </w:pPr>
+      <w:r>
+        <w:t>De un lado está el Ayuntamiento: una oficina de Catastro o de Tesorería necesita un sistema, recibe varias cotizaciones y no tiene con qué compararlas.</w:t>
+      </w:r>
+    </w:p>
+    <w:p>
+      <w:pPr>
+        <w:spacing w:after="80"/>
+      </w:pPr>
+      <w:r>
+        <w:t>Tampoco sabe si el que cotizó más barato va a poder terminar.</w:t>
+      </w:r>
+    </w:p>
+    <w:p>
+      <w:pPr>
+        <w:spacing w:after="80"/>
+      </w:pPr>
+      <w:r>
+        <w:t>Del otro lado está el proveedor, que muchas veces es una persona o una empresa de tres o cuatro.</w:t>
+      </w:r>
+    </w:p>
+    <w:p>
+      <w:pPr>
+        <w:spacing w:after="80"/>
+      </w:pPr>
+      <w:r>
+        <w:t>Sabe programar, pero no sabe cuánto cobrar.</w:t>
+      </w:r>
+    </w:p>
+    <w:p>
+      <w:pPr>
+        <w:spacing w:after="80"/>
+      </w:pPr>
+      <w:r>
+        <w:t>Si cobra caro, pierde el contrato.</w:t>
+      </w:r>
+    </w:p>
+    <w:p>
+      <w:pPr>
+        <w:spacing w:after="80"/>
+      </w:pPr>
+      <w:r>
+        <w:t>Si cobra barato, se queda sin dinero a la mitad y no termina.</w:t>
+      </w:r>
+    </w:p>
+    <w:p>
+      <w:pPr>
+        <w:spacing w:after="80"/>
+      </w:pPr>
+      <w:r>
+        <w:t>Y esto no es una impresión mía.</w:t>
+      </w:r>
+    </w:p>
+    <w:p>
+      <w:pPr>
+        <w:spacing w:after="80"/>
+      </w:pPr>
+      <w:r>
+        <w:t>En un conjunto de ciento veinte proyectos reales, ocho de cada diez costaron más de lo que se había estimado.</w:t>
+      </w:r>
+    </w:p>
+    <w:p>
+      <w:pPr>
+        <w:spacing w:after="80"/>
+      </w:pPr>
+      <w:r>
+        <w:t>Y de más de cuatro mil tareas estimadas por expertos, solo cuatro de cada diez quedaron cerca del valor real.</w:t>
+      </w:r>
+    </w:p>
+    <w:p>
+      <w:pPr>
+        <w:spacing w:after="80"/>
+      </w:pPr>
+      <w:r>
+        <w:t>Estimar mal es lo normal, no la excepción.</w:t>
       </w:r>
     </w:p>
     <w:p>
@@ -288,12 +454,79 @@
     </w:p>
     <w:p>
       <w:r>
-        <w:t>Dura aproximadamente 1.0 minutos.</w:t>
-      </w:r>
-    </w:p>
-    <w:p>
-      <w:r>
-        <w:t>La pregunta de siempre en esta área es cuántas horas de programación lleva un sistema. El asunto es que la forma de hacer software está cambiando mes con mes. En 2024, seis de cada diez desarrolladores usaban inteligencia artificial. En 2025, casi ocho. En 2026, más de ocho. Y lo nuevo no es que la computadora complete una línea, sino que un agente hace la tarea completa: nueve de cada diez profesionales ya usan agentes cada semana. GitHub dice que cuarenta y uno por ciento del código nuevo se genera con inteligencia artificial. Esto ya es un mercado de diez mil millones de dólares. Para la tesis significa algo muy concreto: un modelo que asuma que las horas de programación son el centro del costo se queda corto. Por eso desde el diseño el sistema calcula con cinco formas de hacerlo, no con una sola.</w:t>
+        <w:t>Dura aproximadamente 0.9 minutos.</w:t>
+      </w:r>
+    </w:p>
+    <w:p>
+      <w:pPr>
+        <w:spacing w:after="80"/>
+      </w:pPr>
+      <w:r>
+        <w:t>La pregunta de siempre en esta área es cuántas horas de programación lleva un sistema.</w:t>
+      </w:r>
+    </w:p>
+    <w:p>
+      <w:pPr>
+        <w:spacing w:after="80"/>
+      </w:pPr>
+      <w:r>
+        <w:t>El asunto es que la forma de hacer software está cambiando mes con mes.</w:t>
+      </w:r>
+    </w:p>
+    <w:p>
+      <w:pPr>
+        <w:spacing w:after="80"/>
+      </w:pPr>
+      <w:r>
+        <w:t>En 2024, seis de cada diez desarrolladores usaban inteligencia artificial.</w:t>
+      </w:r>
+    </w:p>
+    <w:p>
+      <w:pPr>
+        <w:spacing w:after="80"/>
+      </w:pPr>
+      <w:r>
+        <w:t>En 2025, casi ocho.</w:t>
+      </w:r>
+    </w:p>
+    <w:p>
+      <w:pPr>
+        <w:spacing w:after="80"/>
+      </w:pPr>
+      <w:r>
+        <w:t>En 2026, más de ocho.</w:t>
+      </w:r>
+    </w:p>
+    <w:p>
+      <w:pPr>
+        <w:spacing w:after="80"/>
+      </w:pPr>
+      <w:r>
+        <w:t>Y lo nuevo no es que la computadora complete una línea, sino que un agente hace la tarea completa: nueve de cada diez profesionales ya usan agentes cada semana.</w:t>
+      </w:r>
+    </w:p>
+    <w:p>
+      <w:pPr>
+        <w:spacing w:after="80"/>
+      </w:pPr>
+      <w:r>
+        <w:t>GitHub dice que cuarenta y uno por ciento del código nuevo se genera con inteligencia artificial.</w:t>
+      </w:r>
+    </w:p>
+    <w:p>
+      <w:pPr>
+        <w:spacing w:after="80"/>
+      </w:pPr>
+      <w:r>
+        <w:t>Para la tesis significa algo muy concreto: un modelo que asuma que las horas de programación son el centro del costo se queda corto.</w:t>
+      </w:r>
+    </w:p>
+    <w:p>
+      <w:pPr>
+        <w:spacing w:after="80"/>
+      </w:pPr>
+      <w:r>
+        <w:t>Por eso desde el diseño el sistema calcula con cinco formas de hacerlo, no con una sola.</w:t>
       </w:r>
     </w:p>
     <w:p>
@@ -314,12 +547,63 @@
     </w:p>
     <w:p>
       <w:r>
-        <w:t>Dura aproximadamente 1.0 minutos.</w:t>
-      </w:r>
-    </w:p>
-    <w:p>
-      <w:r>
-        <w:t>Ahora la otra cara, porque una tesis no puede repetir el folleto de las herramientas. La inteligencia artificial no hace a todos más rápidos. El estudio más serio del año pasado midió a desarrolladores con experiencia trabajando en su propio código: tardaron diecinueve por ciento más, y ellos creían que habían sido veinte por ciento más rápidos. Otro estudio, con seiscientos millones de cambios de código, encontró que se copia mucho más y se limpia mucho menos. Casi la mitad del código generado trae una falla de seguridad. Y los cambios hechos con inteligencia artificial se aceptan mucho menos que los hechos a mano. Entonces, la ganancia depende de dos cosas: de la forma de hacerlo y de qué tan bien sabe usar la herramienta el equipo. Por eso el sistema no aplica un descuento parejo: cobra la herramienta por un lado y acredita el ahorro según la pericia por otro.</w:t>
+        <w:t>Dura aproximadamente 0.9 minutos.</w:t>
+      </w:r>
+    </w:p>
+    <w:p>
+      <w:pPr>
+        <w:spacing w:after="80"/>
+      </w:pPr>
+      <w:r>
+        <w:t>Ahora la otra cara, porque una tesis no puede repetir el folleto de las herramientas.</w:t>
+      </w:r>
+    </w:p>
+    <w:p>
+      <w:pPr>
+        <w:spacing w:after="80"/>
+      </w:pPr>
+      <w:r>
+        <w:t>La inteligencia artificial no hace a todos más rápidos.</w:t>
+      </w:r>
+    </w:p>
+    <w:p>
+      <w:pPr>
+        <w:spacing w:after="80"/>
+      </w:pPr>
+      <w:r>
+        <w:t>El estudio más serio del año pasado midió a desarrolladores con experiencia trabajando en su propio código: tardaron diecinueve por ciento más, y ellos creían que habían sido veinte por ciento más rápidos.</w:t>
+      </w:r>
+    </w:p>
+    <w:p>
+      <w:pPr>
+        <w:spacing w:after="80"/>
+      </w:pPr>
+      <w:r>
+        <w:t>Otro estudio, con seiscientos millones de cambios de código, encontró que se copia mucho más y se limpia mucho menos.</w:t>
+      </w:r>
+    </w:p>
+    <w:p>
+      <w:pPr>
+        <w:spacing w:after="80"/>
+      </w:pPr>
+      <w:r>
+        <w:t>Casi la mitad del código generado trae una falla de seguridad.</w:t>
+      </w:r>
+    </w:p>
+    <w:p>
+      <w:pPr>
+        <w:spacing w:after="80"/>
+      </w:pPr>
+      <w:r>
+        <w:t>Entonces, la ganancia depende de dos cosas: de la forma de hacerlo y de qué tan bien sabe usar la herramienta el equipo.</w:t>
+      </w:r>
+    </w:p>
+    <w:p>
+      <w:pPr>
+        <w:spacing w:after="80"/>
+      </w:pPr>
+      <w:r>
+        <w:t>Por eso el sistema no aplica un descuento parejo: cobra la herramienta por un lado y, por otro, reconoce el ahorro según qué tanto sabe usarla el equipo.</w:t>
       </w:r>
     </w:p>
     <w:p>
@@ -344,8 +628,99 @@
       </w:r>
     </w:p>
     <w:p>
-      <w:r>
-        <w:t>Hay algo que aprendí haciendo el sistema y que los datos de este año confirman. Construir el sistema es más rápido, sí, pero lo que más cambió es el detalle. El ajuste chico. Que este texto no se ve bien, que este campo debe validar. Antes eso era un ticket, una espera y a veces un cobro aparte. Hoy se resuelve en la misma sesión. Atlassian lo midió en tres mil cuatrocientos repositorios, que son los lugares donde se guarda el código de cada sistema. Los cambios terminados subieron diecinueve por ciento y cada persona ahorra de dos a cuatro horas por semana. El efecto es mayor en los sistemas chicos, que son justo los de un proveedor municipal. Esto tiene una consecuencia dura para el que cobra: el desarrollador que sigue cobrando cada detalle como si costara un día se va a quedar sin clientes, porque llega otro y lo hace en una tarde. Y tiene una consecuencia para mi sistema: el costo de cada cambio ahora se ajusta por la forma de hacerlo, con la misma regla que usa la calculadora de cambios. Lo van a ver en una pantalla más adelante.</w:t>
+      <w:pPr>
+        <w:spacing w:after="80"/>
+      </w:pPr>
+      <w:r>
+        <w:t>Hay algo que aprendí haciendo el sistema y que los datos de este año confirman.</w:t>
+      </w:r>
+    </w:p>
+    <w:p>
+      <w:pPr>
+        <w:spacing w:after="80"/>
+      </w:pPr>
+      <w:r>
+        <w:t>Construir el sistema es más rápido, sí, pero lo que más cambió es el detalle.</w:t>
+      </w:r>
+    </w:p>
+    <w:p>
+      <w:pPr>
+        <w:spacing w:after="80"/>
+      </w:pPr>
+      <w:r>
+        <w:t>El ajuste chico.</w:t>
+      </w:r>
+    </w:p>
+    <w:p>
+      <w:pPr>
+        <w:spacing w:after="80"/>
+      </w:pPr>
+      <w:r>
+        <w:t>Que este texto no se ve bien, que este campo debe validar.</w:t>
+      </w:r>
+    </w:p>
+    <w:p>
+      <w:pPr>
+        <w:spacing w:after="80"/>
+      </w:pPr>
+      <w:r>
+        <w:t>Antes eso era un ticket, una espera y a veces un cobro aparte.</w:t>
+      </w:r>
+    </w:p>
+    <w:p>
+      <w:pPr>
+        <w:spacing w:after="80"/>
+      </w:pPr>
+      <w:r>
+        <w:t>Hoy se resuelve en la misma sesión.</w:t>
+      </w:r>
+    </w:p>
+    <w:p>
+      <w:pPr>
+        <w:spacing w:after="80"/>
+      </w:pPr>
+      <w:r>
+        <w:t>Atlassian lo midió en tres mil cuatrocientos repositorios, que son los lugares donde se guarda el código de cada sistema.</w:t>
+      </w:r>
+    </w:p>
+    <w:p>
+      <w:pPr>
+        <w:spacing w:after="80"/>
+      </w:pPr>
+      <w:r>
+        <w:t>Los cambios terminados subieron diecinueve por ciento y cada persona ahorra de dos a cuatro horas por semana.</w:t>
+      </w:r>
+    </w:p>
+    <w:p>
+      <w:pPr>
+        <w:spacing w:after="80"/>
+      </w:pPr>
+      <w:r>
+        <w:t>El efecto es mayor en los sistemas chicos, que son justo los de un proveedor municipal.</w:t>
+      </w:r>
+    </w:p>
+    <w:p>
+      <w:pPr>
+        <w:spacing w:after="80"/>
+      </w:pPr>
+      <w:r>
+        <w:t>Esto tiene una consecuencia dura para el que cobra: el desarrollador que sigue cobrando cada detalle como si costara un día se va a quedar sin clientes, porque llega otro y lo hace en una tarde.</w:t>
+      </w:r>
+    </w:p>
+    <w:p>
+      <w:pPr>
+        <w:spacing w:after="80"/>
+      </w:pPr>
+      <w:r>
+        <w:t>Y tiene una consecuencia para mi sistema: el costo de cada cambio ahora se ajusta por la forma de hacerlo, con la misma regla que usa la calculadora de cambios.</w:t>
+      </w:r>
+    </w:p>
+    <w:p>
+      <w:pPr>
+        <w:spacing w:after="80"/>
+      </w:pPr>
+      <w:r>
+        <w:t>Lo van a ver en una pantalla más adelante.</w:t>
       </w:r>
     </w:p>
     <w:p>
@@ -370,8 +745,83 @@
       </w:r>
     </w:p>
     <w:p>
-      <w:r>
-        <w:t>Con ese terreno, esta es la pregunta de la tesis. Si se puede calcular desde el inicio, con los datos que sí se conocen al principio, cuánto va a costar y tardar un sistema municipal. Y que el error sea chico como para decidir con él. La hipótesis del sistema, o sea lo que yo creo y quiero comprobar, es que la estimación mejora cuando todo se junta en un mismo cálculo. Las piezas del sistema, los cambios, la forma de hacerlo, el equipo, la nómina con sus impuestos, el flujo de dinero y el mantenimiento. Y en el artículo probé tres ideas más chicas con datos públicos. Que el juicio del experto por sí solo no basta. Que las tareas de cambio pesan distinto. Y que con los datos del inicio se le puede ganar al promedio. Les adelanto que la segunda no se confirmó, y eso también es un resultado.</w:t>
+      <w:pPr>
+        <w:spacing w:after="80"/>
+      </w:pPr>
+      <w:r>
+        <w:t>Con ese terreno, esta es la pregunta de la tesis.</w:t>
+      </w:r>
+    </w:p>
+    <w:p>
+      <w:pPr>
+        <w:spacing w:after="80"/>
+      </w:pPr>
+      <w:r>
+        <w:t>Si se puede calcular desde el inicio, con los datos que sí se conocen al principio, cuánto va a costar y tardar un sistema municipal.</w:t>
+      </w:r>
+    </w:p>
+    <w:p>
+      <w:pPr>
+        <w:spacing w:after="80"/>
+      </w:pPr>
+      <w:r>
+        <w:t>Y que el error sea chico como para decidir con él.</w:t>
+      </w:r>
+    </w:p>
+    <w:p>
+      <w:pPr>
+        <w:spacing w:after="80"/>
+      </w:pPr>
+      <w:r>
+        <w:t>La hipótesis del sistema, o sea lo que yo creo y quiero comprobar, es que la estimación mejora cuando todo se junta en un mismo cálculo.</w:t>
+      </w:r>
+    </w:p>
+    <w:p>
+      <w:pPr>
+        <w:spacing w:after="80"/>
+      </w:pPr>
+      <w:r>
+        <w:t>Las piezas del sistema, los cambios, la forma de hacerlo, el equipo, la nómina con sus impuestos, el flujo de dinero y el mantenimiento.</w:t>
+      </w:r>
+    </w:p>
+    <w:p>
+      <w:pPr>
+        <w:spacing w:after="80"/>
+      </w:pPr>
+      <w:r>
+        <w:t>Y en el artículo probé tres ideas más chicas con datos públicos.</w:t>
+      </w:r>
+    </w:p>
+    <w:p>
+      <w:pPr>
+        <w:spacing w:after="80"/>
+      </w:pPr>
+      <w:r>
+        <w:t>Que el juicio del experto por sí solo no basta.</w:t>
+      </w:r>
+    </w:p>
+    <w:p>
+      <w:pPr>
+        <w:spacing w:after="80"/>
+      </w:pPr>
+      <w:r>
+        <w:t>Que las tareas de cambio pesan distinto.</w:t>
+      </w:r>
+    </w:p>
+    <w:p>
+      <w:pPr>
+        <w:spacing w:after="80"/>
+      </w:pPr>
+      <w:r>
+        <w:t>Y que con los datos del inicio se le puede ganar al promedio.</w:t>
+      </w:r>
+    </w:p>
+    <w:p>
+      <w:pPr>
+        <w:spacing w:after="80"/>
+      </w:pPr>
+      <w:r>
+        <w:t>Les adelanto que la segunda no se confirmó, y eso también es un resultado.</w:t>
       </w:r>
     </w:p>
     <w:p>
@@ -396,8 +846,75 @@
       </w:r>
     </w:p>
     <w:p>
-      <w:r>
-        <w:t>Esta gráfica es del dataset JOSSE: tareas reales de proyectos de código abierto. Cada punto es una tarea. En el eje de abajo está lo que el experto estimó y en el eje vertical lo que costó de verdad. La línea diagonal sería la estimación perfecta. Fíjense en dos cosas. Una: los puntos suben junto con la línea, o sea que el experto sí sabe qué tarea es grande y cuál es chica; la correlación es de cero punto setenta y nueve. Dos: los puntos están muy regados alrededor de la línea; solo cuatro de cada diez caen cerca. El experto ordena, pero no dimensiona.</w:t>
+      <w:pPr>
+        <w:spacing w:after="80"/>
+      </w:pPr>
+      <w:r>
+        <w:t>Esta gráfica es del dataset JOSSE: tareas reales de proyectos de código abierto.</w:t>
+      </w:r>
+    </w:p>
+    <w:p>
+      <w:pPr>
+        <w:spacing w:after="80"/>
+      </w:pPr>
+      <w:r>
+        <w:t>Cada punto es una tarea.</w:t>
+      </w:r>
+    </w:p>
+    <w:p>
+      <w:pPr>
+        <w:spacing w:after="80"/>
+      </w:pPr>
+      <w:r>
+        <w:t>En el eje de abajo está lo que el experto estimó y en el eje vertical lo que costó de verdad.</w:t>
+      </w:r>
+    </w:p>
+    <w:p>
+      <w:pPr>
+        <w:spacing w:after="80"/>
+      </w:pPr>
+      <w:r>
+        <w:t>La línea diagonal sería la estimación perfecta.</w:t>
+      </w:r>
+    </w:p>
+    <w:p>
+      <w:pPr>
+        <w:spacing w:after="80"/>
+      </w:pPr>
+      <w:r>
+        <w:t>Fíjense en dos cosas.</w:t>
+      </w:r>
+    </w:p>
+    <w:p>
+      <w:pPr>
+        <w:spacing w:after="80"/>
+      </w:pPr>
+      <w:r>
+        <w:t>Una: los puntos suben junto con la línea, o sea que el experto sí sabe qué tarea es grande y cuál es chica.</w:t>
+      </w:r>
+    </w:p>
+    <w:p>
+      <w:pPr>
+        <w:spacing w:after="80"/>
+      </w:pPr>
+      <w:r>
+        <w:t>Eso en estadística se llama correlación, y aquí es alta, de cero punto setenta y nueve.</w:t>
+      </w:r>
+    </w:p>
+    <w:p>
+      <w:pPr>
+        <w:spacing w:after="80"/>
+      </w:pPr>
+      <w:r>
+        <w:t>Dos: los puntos están muy regados alrededor de la línea; solo cuatro de cada diez caen cerca.</w:t>
+      </w:r>
+    </w:p>
+    <w:p>
+      <w:pPr>
+        <w:spacing w:after="80"/>
+      </w:pPr>
+      <w:r>
+        <w:t>El experto ordena, pero no dimensiona.</w:t>
       </w:r>
     </w:p>
     <w:p>
@@ -422,8 +939,35 @@
       </w:r>
     </w:p>
     <w:p>
-      <w:r>
-        <w:t>Esta otra gráfica son proyectos completos, ciento veinte, de cuarenta y dos organizaciones. Aquí casi todos los puntos están arriba de la línea. Eso quiere decir que costaron más de lo estimado: ochenta y uno por ciento subestimados, y el proyecto de en medio se pasó cincuenta y ocho por ciento de lo estimado. Es la imagen del problema del que hablé al principio.</w:t>
+      <w:pPr>
+        <w:spacing w:after="80"/>
+      </w:pPr>
+      <w:r>
+        <w:t>Esta otra gráfica son proyectos completos, ciento veinte, de cuarenta y dos organizaciones.</w:t>
+      </w:r>
+    </w:p>
+    <w:p>
+      <w:pPr>
+        <w:spacing w:after="80"/>
+      </w:pPr>
+      <w:r>
+        <w:t>Aquí casi todos los puntos están arriba de la línea.</w:t>
+      </w:r>
+    </w:p>
+    <w:p>
+      <w:pPr>
+        <w:spacing w:after="80"/>
+      </w:pPr>
+      <w:r>
+        <w:t>Eso quiere decir que costaron más de lo estimado: ochenta y uno por ciento subestimados, y el proyecto de en medio se pasó cincuenta y ocho por ciento de lo estimado.</w:t>
+      </w:r>
+    </w:p>
+    <w:p>
+      <w:pPr>
+        <w:spacing w:after="80"/>
+      </w:pPr>
+      <w:r>
+        <w:t>Es la imagen del problema del que hablé al principio.</w:t>
       </w:r>
     </w:p>
     <w:p>
@@ -448,8 +992,67 @@
       </w:r>
     </w:p>
     <w:p>
-      <w:r>
-        <w:t>Resumo lo que dicen los datos. Primero: con las variables que se conocen al inicio del proyecto, un modelo estadístico que se llama bosque aleatorio explicó ochenta y uno por ciento de la variación del esfuerzo en los proyectos completos. El promedio, que es lo que se usa normalmente, explicó cero. Eso respalda la tercera hipótesis. Segundo: el experto ordena pero no dimensiona; eso respalda la primera. Tercero: la segunda hipótesis no se confirmó: buscar cambios por palabras en el texto de la tarea no distingue nada. Por eso el sistema captura los cambios de forma estructurada, con su tipo y su fase, en lugar de adivinarlos del texto. Todo esto lo verificó un programa aparte, veintiséis de veintiséis comprobaciones.</w:t>
+      <w:pPr>
+        <w:spacing w:after="80"/>
+      </w:pPr>
+      <w:r>
+        <w:t>Resumo lo que dicen los datos.</w:t>
+      </w:r>
+    </w:p>
+    <w:p>
+      <w:pPr>
+        <w:spacing w:after="80"/>
+      </w:pPr>
+      <w:r>
+        <w:t>Primero: con las variables que se conocen al inicio del proyecto, un modelo estadístico que se llama bosque aleatorio explicó ochenta y uno por ciento de la variación del esfuerzo en los proyectos completos.</w:t>
+      </w:r>
+    </w:p>
+    <w:p>
+      <w:pPr>
+        <w:spacing w:after="80"/>
+      </w:pPr>
+      <w:r>
+        <w:t>El promedio, que es lo que se usa normalmente, explicó cero.</w:t>
+      </w:r>
+    </w:p>
+    <w:p>
+      <w:pPr>
+        <w:spacing w:after="80"/>
+      </w:pPr>
+      <w:r>
+        <w:t>Eso respalda la tercera hipótesis.</w:t>
+      </w:r>
+    </w:p>
+    <w:p>
+      <w:pPr>
+        <w:spacing w:after="80"/>
+      </w:pPr>
+      <w:r>
+        <w:t>Segundo: el experto ordena pero no dimensiona; eso respalda la primera.</w:t>
+      </w:r>
+    </w:p>
+    <w:p>
+      <w:pPr>
+        <w:spacing w:after="80"/>
+      </w:pPr>
+      <w:r>
+        <w:t>Tercero: la segunda hipótesis no se confirmó: buscar cambios por palabras en el texto de la tarea no distingue nada.</w:t>
+      </w:r>
+    </w:p>
+    <w:p>
+      <w:pPr>
+        <w:spacing w:after="80"/>
+      </w:pPr>
+      <w:r>
+        <w:t>Por eso el sistema captura los cambios de forma estructurada, con su tipo y su fase, en lugar de adivinarlos del texto.</w:t>
+      </w:r>
+    </w:p>
+    <w:p>
+      <w:pPr>
+        <w:spacing w:after="80"/>
+      </w:pPr>
+      <w:r>
+        <w:t>Todo esto lo verificó un programa aparte, veintiséis de veintiséis comprobaciones.</w:t>
       </w:r>
     </w:p>
     <w:p>
@@ -474,8 +1077,51 @@
       </w:r>
     </w:p>
     <w:p>
-      <w:r>
-        <w:t>Este es el sistema. Se llama EMPS Fresnillo. Está en internet, en estimacion punto hazlatarea punto com, y no pide cuenta ni contraseña. La portada ofrece dos caminos: cotizar en un minuto, o crear un proyecto completo en cinco pasos. Y tiene un ejemplo ya capturado para que cualquiera vea cómo funciona antes de escribir nada. Nota para el video: aquí puedes cambiar a la ventana del navegador y mostrarlo en vivo.</w:t>
+      <w:pPr>
+        <w:spacing w:after="80"/>
+      </w:pPr>
+      <w:r>
+        <w:t>Este es el sistema.</w:t>
+      </w:r>
+    </w:p>
+    <w:p>
+      <w:pPr>
+        <w:spacing w:after="80"/>
+      </w:pPr>
+      <w:r>
+        <w:t>Se llama EMPS Fresnillo.</w:t>
+      </w:r>
+    </w:p>
+    <w:p>
+      <w:pPr>
+        <w:spacing w:after="80"/>
+      </w:pPr>
+      <w:r>
+        <w:t>Está en internet, en estimacion punto hazlatarea punto com, y no pide cuenta ni contraseña.</w:t>
+      </w:r>
+    </w:p>
+    <w:p>
+      <w:pPr>
+        <w:spacing w:after="80"/>
+      </w:pPr>
+      <w:r>
+        <w:t>La portada ofrece dos caminos: cotizar en un minuto, o crear un proyecto completo en cinco pasos.</w:t>
+      </w:r>
+    </w:p>
+    <w:p>
+      <w:pPr>
+        <w:spacing w:after="80"/>
+      </w:pPr>
+      <w:r>
+        <w:t>Y tiene un ejemplo ya capturado para que cualquiera vea cómo funciona antes de escribir nada.</w:t>
+      </w:r>
+    </w:p>
+    <w:p>
+      <w:pPr>
+        <w:spacing w:after="80"/>
+      </w:pPr>
+      <w:r>
+        <w:t>Nota para el video: aquí puedes cambiar a la ventana del navegador y mostrarlo en vivo.</w:t>
       </w:r>
     </w:p>
     <w:p>
@@ -500,8 +1146,35 @@
       </w:r>
     </w:p>
     <w:p>
-      <w:r>
-        <w:t>Para que la gente lo use, la entrada tiene que ser fácil. Cotizar en un minuto pregunta tres cosas: qué sistema necesitas, qué partes debe tener, y cuánto dinero tienes y para cuándo. Además pregunta quién va a resolver dudas del lado del cliente y si el equipo ya programa con inteligencia artificial. Con eso el sistema crea el proyecto con valores típicos, corre quince estimaciones en menos de un segundo y te lleva al resultado.</w:t>
+      <w:pPr>
+        <w:spacing w:after="80"/>
+      </w:pPr>
+      <w:r>
+        <w:t>Para que la gente lo use, la entrada tiene que ser fácil.</w:t>
+      </w:r>
+    </w:p>
+    <w:p>
+      <w:pPr>
+        <w:spacing w:after="80"/>
+      </w:pPr>
+      <w:r>
+        <w:t>Cotizar en un minuto pregunta tres cosas: qué sistema necesitas, qué partes debe tener, y cuánto dinero tienes y para cuándo.</w:t>
+      </w:r>
+    </w:p>
+    <w:p>
+      <w:pPr>
+        <w:spacing w:after="80"/>
+      </w:pPr>
+      <w:r>
+        <w:t>Además pregunta quién va a resolver dudas del lado del cliente y si el equipo ya programa con inteligencia artificial.</w:t>
+      </w:r>
+    </w:p>
+    <w:p>
+      <w:pPr>
+        <w:spacing w:after="80"/>
+      </w:pPr>
+      <w:r>
+        <w:t>Con eso el sistema crea el proyecto con valores típicos, corre quince estimaciones en menos de un segundo y te lleva al resultado.</w:t>
       </w:r>
     </w:p>
     <w:p>
@@ -526,8 +1199,27 @@
       </w:r>
     </w:p>
     <w:p>
-      <w:r>
-        <w:t>Lo primero que ve la persona es esto, antes de cualquier tabla. Cuatro respuestas: cuánto va a costar, con IVA; cuánto va a tardar, en meses; si le alcanza con el dinero que tiene; y qué opción eligió, o cuál le recomendamos si todavía no elige. Todo lo demás de la pantalla explica estos cuatro renglones.</w:t>
+      <w:pPr>
+        <w:spacing w:after="80"/>
+      </w:pPr>
+      <w:r>
+        <w:t>Lo primero que ve la persona es esto, antes de cualquier tabla.</w:t>
+      </w:r>
+    </w:p>
+    <w:p>
+      <w:pPr>
+        <w:spacing w:after="80"/>
+      </w:pPr>
+      <w:r>
+        <w:t>Cuatro respuestas: cuánto va a costar, con IVA; cuánto va a tardar, en meses; si le alcanza con el dinero que tiene; y qué opción eligió, o cuál le recomendamos si todavía no elige.</w:t>
+      </w:r>
+    </w:p>
+    <w:p>
+      <w:pPr>
+        <w:spacing w:after="80"/>
+      </w:pPr>
+      <w:r>
+        <w:t>Todo lo demás de la pantalla explica estos cuatro renglones.</w:t>
       </w:r>
     </w:p>
     <w:p>
@@ -552,8 +1244,67 @@
       </w:r>
     </w:p>
     <w:p>
-      <w:r>
-        <w:t>Esto es lo que más me pedían: saber de dónde sale el número. Cada resultado trae su cadena de cálculo, renglón por renglón, con la operación en palabras. Empieza con las horas base de las piezas del sistema. Se ajustan por qué tan claro está lo que se quiere y por el riesgo. Luego entra la forma de hacerlo, que ahorra horas según la pericia del equipo. Las semanas salen de dividir entre la capacidad del equipo. Y el costo mensual suma sueldos con todas sus cargas, herramientas de inteligencia artificial, otras herramientas y administración. Cualquiera puede rehacer la cuenta con una calculadora y le va a dar.</w:t>
+      <w:pPr>
+        <w:spacing w:after="80"/>
+      </w:pPr>
+      <w:r>
+        <w:t>Esto es lo que más me pedían: saber de dónde sale el número.</w:t>
+      </w:r>
+    </w:p>
+    <w:p>
+      <w:pPr>
+        <w:spacing w:after="80"/>
+      </w:pPr>
+      <w:r>
+        <w:t>Cada resultado trae su cadena de cálculo, renglón por renglón, con la operación en palabras.</w:t>
+      </w:r>
+    </w:p>
+    <w:p>
+      <w:pPr>
+        <w:spacing w:after="80"/>
+      </w:pPr>
+      <w:r>
+        <w:t>Empieza con las horas base de las piezas del sistema.</w:t>
+      </w:r>
+    </w:p>
+    <w:p>
+      <w:pPr>
+        <w:spacing w:after="80"/>
+      </w:pPr>
+      <w:r>
+        <w:t>Se ajustan por qué tan claro está lo que se quiere y por el riesgo.</w:t>
+      </w:r>
+    </w:p>
+    <w:p>
+      <w:pPr>
+        <w:spacing w:after="80"/>
+      </w:pPr>
+      <w:r>
+        <w:t>Luego entra la forma de hacerlo, que ahorra horas según la pericia del equipo.</w:t>
+      </w:r>
+    </w:p>
+    <w:p>
+      <w:pPr>
+        <w:spacing w:after="80"/>
+      </w:pPr>
+      <w:r>
+        <w:t>Las semanas salen de dividir entre la capacidad del equipo.</w:t>
+      </w:r>
+    </w:p>
+    <w:p>
+      <w:pPr>
+        <w:spacing w:after="80"/>
+      </w:pPr>
+      <w:r>
+        <w:t>Y el costo mensual suma sueldos con todas sus cargas, herramientas de inteligencia artificial, otras herramientas y administración.</w:t>
+      </w:r>
+    </w:p>
+    <w:p>
+      <w:pPr>
+        <w:spacing w:after="80"/>
+      </w:pPr>
+      <w:r>
+        <w:t>Cualquiera puede rehacer la cuenta con una calculadora y le va a dar.</w:t>
       </w:r>
     </w:p>
     <w:p>
@@ -578,8 +1329,43 @@
       </w:r>
     </w:p>
     <w:p>
-      <w:r>
-        <w:t>El mismo proyecto, con el mismo equipo, se calcula en cinco formas de hacerlo: todo a mano, con ayuda de inteligencia artificial, híbrido, casi todo con inteligencia artificial, y con plataformas de armado sin programar. Pero no se le dan quince números a la persona. Se le dan tres tarjetas: la recomendada, la que eligió, y la más segura. Cada una con su precio, sus meses, su riesgo y si esa forma sirve para este proyecto. La tabla completa está abajo, plegada, para quien la quiera ver.</w:t>
+      <w:pPr>
+        <w:spacing w:after="80"/>
+      </w:pPr>
+      <w:r>
+        <w:t>El mismo proyecto, con el mismo equipo, se calcula en cinco formas de hacerlo: todo a mano, con ayuda de inteligencia artificial, híbrido, casi todo con inteligencia artificial, y con plataformas de armado sin programar.</w:t>
+      </w:r>
+    </w:p>
+    <w:p>
+      <w:pPr>
+        <w:spacing w:after="80"/>
+      </w:pPr>
+      <w:r>
+        <w:t>Pero no se le dan quince números a la persona.</w:t>
+      </w:r>
+    </w:p>
+    <w:p>
+      <w:pPr>
+        <w:spacing w:after="80"/>
+      </w:pPr>
+      <w:r>
+        <w:t>Se le dan tres tarjetas: la recomendada, la que eligió, y la más segura.</w:t>
+      </w:r>
+    </w:p>
+    <w:p>
+      <w:pPr>
+        <w:spacing w:after="80"/>
+      </w:pPr>
+      <w:r>
+        <w:t>Cada una con su precio, sus meses, su riesgo y si esa forma sirve para este proyecto.</w:t>
+      </w:r>
+    </w:p>
+    <w:p>
+      <w:pPr>
+        <w:spacing w:after="80"/>
+      </w:pPr>
+      <w:r>
+        <w:t>La tabla completa está abajo, plegada, para quien la quiera ver.</w:t>
       </w:r>
     </w:p>
     <w:p>
@@ -604,8 +1390,75 @@
       </w:r>
     </w:p>
     <w:p>
-      <w:r>
-        <w:t>Este es el hallazgo que sostiene la tesis. Miren las cifras del mismo proyecto: a mano, casi tres millones de pesos y treinta y una semanas. Híbrido, novecientos mil y doce semanas. Casi todo con inteligencia artificial, seiscientos cuarenta y seis mil y ocho semanas. Plataforma de armado, trescientos once mil y cuatro semanas. Nueve veces de diferencia. Por eso digo que la forma de hacerlo pesa más que el precio. Pero la más barata no siempre sirve: una plataforma de armado no sirve para un sistema con datos personales y cuatro conexiones externas, aunque sea la más barata, y el sistema la descarta y dice por qué. Y hacer casi todo con inteligencia artificial no se le recomienda a un equipo que nunca la ha usado.</w:t>
+      <w:pPr>
+        <w:spacing w:after="80"/>
+      </w:pPr>
+      <w:r>
+        <w:t>Este es el hallazgo que sostiene la tesis.</w:t>
+      </w:r>
+    </w:p>
+    <w:p>
+      <w:pPr>
+        <w:spacing w:after="80"/>
+      </w:pPr>
+      <w:r>
+        <w:t>Miren las cifras del mismo proyecto: a mano, casi tres millones de pesos y treinta y una semanas.</w:t>
+      </w:r>
+    </w:p>
+    <w:p>
+      <w:pPr>
+        <w:spacing w:after="80"/>
+      </w:pPr>
+      <w:r>
+        <w:t>Híbrido, novecientos mil y doce semanas.</w:t>
+      </w:r>
+    </w:p>
+    <w:p>
+      <w:pPr>
+        <w:spacing w:after="80"/>
+      </w:pPr>
+      <w:r>
+        <w:t>Casi todo con inteligencia artificial, seiscientos cuarenta y seis mil y ocho semanas.</w:t>
+      </w:r>
+    </w:p>
+    <w:p>
+      <w:pPr>
+        <w:spacing w:after="80"/>
+      </w:pPr>
+      <w:r>
+        <w:t>Plataforma de armado, trescientos once mil y cuatro semanas.</w:t>
+      </w:r>
+    </w:p>
+    <w:p>
+      <w:pPr>
+        <w:spacing w:after="80"/>
+      </w:pPr>
+      <w:r>
+        <w:t>Nueve veces de diferencia.</w:t>
+      </w:r>
+    </w:p>
+    <w:p>
+      <w:pPr>
+        <w:spacing w:after="80"/>
+      </w:pPr>
+      <w:r>
+        <w:t>Por eso digo que la forma de hacerlo pesa más que el precio.</w:t>
+      </w:r>
+    </w:p>
+    <w:p>
+      <w:pPr>
+        <w:spacing w:after="80"/>
+      </w:pPr>
+      <w:r>
+        <w:t>Pero la más barata no siempre sirve: una plataforma de armado no sirve para un sistema con datos personales y cuatro conexiones externas, aunque sea la más barata, y el sistema la descarta y dice por qué.</w:t>
+      </w:r>
+    </w:p>
+    <w:p>
+      <w:pPr>
+        <w:spacing w:after="80"/>
+      </w:pPr>
+      <w:r>
+        <w:t>Y hacer casi todo con inteligencia artificial no se le recomienda a un equipo que nunca la ha usado.</w:t>
       </w:r>
     </w:p>
     <w:p>
@@ -630,8 +1483,43 @@
       </w:r>
     </w:p>
     <w:p>
-      <w:r>
-        <w:t>Esta parte sale de una investigación de precios que hice el nueve de septiembre con las páginas oficiales de cada herramienta. Las herramientas se cobran por persona, no por equipo, porque así las venden: un asiento por cada persona técnica. Y como en la vida real cada quien trae su plan, hay tres niveles: básico, típico y máximo. Por ejemplo, para casi todo con inteligencia artificial, cien, doscientos cincuenta o cuatrocientos dólares por persona al mes. Se elige por proyecto, y además cada persona puede traer su propio plan.</w:t>
+      <w:pPr>
+        <w:spacing w:after="80"/>
+      </w:pPr>
+      <w:r>
+        <w:t>Esta parte sale de una investigación de precios que hice el nueve de septiembre con las páginas oficiales de cada herramienta.</w:t>
+      </w:r>
+    </w:p>
+    <w:p>
+      <w:pPr>
+        <w:spacing w:after="80"/>
+      </w:pPr>
+      <w:r>
+        <w:t>Las herramientas se cobran por persona, no por equipo, porque así las venden: un asiento por cada persona técnica.</w:t>
+      </w:r>
+    </w:p>
+    <w:p>
+      <w:pPr>
+        <w:spacing w:after="80"/>
+      </w:pPr>
+      <w:r>
+        <w:t>Y como en la vida real cada quien trae su plan, hay tres niveles: básico, típico y máximo.</w:t>
+      </w:r>
+    </w:p>
+    <w:p>
+      <w:pPr>
+        <w:spacing w:after="80"/>
+      </w:pPr>
+      <w:r>
+        <w:t>Por ejemplo, para casi todo con inteligencia artificial, cien, doscientos cincuenta o cuatrocientos dólares por persona al mes.</w:t>
+      </w:r>
+    </w:p>
+    <w:p>
+      <w:pPr>
+        <w:spacing w:after="80"/>
+      </w:pPr>
+      <w:r>
+        <w:t>Se elige por proyecto, y además cada persona puede traer su propio plan.</w:t>
       </w:r>
     </w:p>
     <w:p>
@@ -652,12 +1540,47 @@
     </w:p>
     <w:p>
       <w:r>
-        <w:t>Dura aproximadamente 0.7 minutos.</w:t>
-      </w:r>
-    </w:p>
-    <w:p>
-      <w:r>
-        <w:t>Y esto es lo que el sistema le enseña antes de calcular: con este equipo de cuatro personas técnicas, cuánto costarían las herramientas al mes en cada forma de hacerlo, y qué parte del ahorro se acredita según la pericia del equipo. La pericia se captura por persona, del uno al cinco. Los ahorros publicados están calibrados para quien usa la herramienta a diario y sabe darle instrucciones. A quien nunca la ha usado solo se le acredita treinta y cinco por ciento, porque un modelo muy potente en manos de quien no sabe pedirle las cosas no ahorra tiempo. Eso es exactamente lo que midió el estudio de METR.</w:t>
+        <w:t>Dura aproximadamente 0.8 minutos.</w:t>
+      </w:r>
+    </w:p>
+    <w:p>
+      <w:pPr>
+        <w:spacing w:after="80"/>
+      </w:pPr>
+      <w:r>
+        <w:t>Y esto es lo que el sistema le enseña antes de calcular: con este equipo de cuatro personas técnicas, cuánto costarían las herramientas al mes en cada forma de hacerlo, y qué parte del ahorro se le reconoce según la pericia del equipo, o sea, qué tan bien saben usar la herramienta.</w:t>
+      </w:r>
+    </w:p>
+    <w:p>
+      <w:pPr>
+        <w:spacing w:after="80"/>
+      </w:pPr>
+      <w:r>
+        <w:t>Eso se captura por persona, del uno al cinco.</w:t>
+      </w:r>
+    </w:p>
+    <w:p>
+      <w:pPr>
+        <w:spacing w:after="80"/>
+      </w:pPr>
+      <w:r>
+        <w:t>Los ahorros publicados están calibrados para quien usa la herramienta a diario y sabe darle instrucciones.</w:t>
+      </w:r>
+    </w:p>
+    <w:p>
+      <w:pPr>
+        <w:spacing w:after="80"/>
+      </w:pPr>
+      <w:r>
+        <w:t>A quien nunca la ha usado solo se le reconoce treinta y cinco por ciento del ahorro, porque un modelo muy potente en manos de quien no sabe pedirle las cosas no ahorra tiempo.</w:t>
+      </w:r>
+    </w:p>
+    <w:p>
+      <w:pPr>
+        <w:spacing w:after="80"/>
+      </w:pPr>
+      <w:r>
+        <w:t>Eso es exactamente lo que midió el estudio de METR.</w:t>
       </w:r>
     </w:p>
     <w:p>
@@ -682,8 +1605,59 @@
       </w:r>
     </w:p>
     <w:p>
-      <w:r>
-        <w:t>Un desarrollador puede saber programar muy bien y no saber lo que cuesta una nómina. El sistema lo pone en el número. Sobre el sueldo van las cuotas del IMSS, el INFONAVIT, el impuesto sobre nómina de Zacatecas, las prestaciones de ley, y si el proyecto pasa de seis meses, la liquidación. Y luego el flujo: el proveedor paga la nómina cada mes, pero cobra por anticipo, entregas y pago final. Hay un mes en el que ya pagó y el cliente no le ha terminado de pagar. La tercera tarjeta lo dice: te van a deber tanto en el mes tal. Ese es el mes en que los proyectos se abandonan.</w:t>
+      <w:pPr>
+        <w:spacing w:after="80"/>
+      </w:pPr>
+      <w:r>
+        <w:t>Un desarrollador puede saber programar muy bien y no saber lo que cuesta una nómina.</w:t>
+      </w:r>
+    </w:p>
+    <w:p>
+      <w:pPr>
+        <w:spacing w:after="80"/>
+      </w:pPr>
+      <w:r>
+        <w:t>El sistema lo pone en el número.</w:t>
+      </w:r>
+    </w:p>
+    <w:p>
+      <w:pPr>
+        <w:spacing w:after="80"/>
+      </w:pPr>
+      <w:r>
+        <w:t>Sobre el sueldo van las cuotas del IMSS, el INFONAVIT, el impuesto sobre nómina de Zacatecas, las prestaciones de ley, y si el proyecto pasa de seis meses, la liquidación.</w:t>
+      </w:r>
+    </w:p>
+    <w:p>
+      <w:pPr>
+        <w:spacing w:after="80"/>
+      </w:pPr>
+      <w:r>
+        <w:t>Y luego el flujo: el proveedor paga la nómina cada mes, pero cobra por anticipo, entregas y pago final.</w:t>
+      </w:r>
+    </w:p>
+    <w:p>
+      <w:pPr>
+        <w:spacing w:after="80"/>
+      </w:pPr>
+      <w:r>
+        <w:t>Hay un mes en el que ya pagó y el cliente no le ha terminado de pagar.</w:t>
+      </w:r>
+    </w:p>
+    <w:p>
+      <w:pPr>
+        <w:spacing w:after="80"/>
+      </w:pPr>
+      <w:r>
+        <w:t>La tercera tarjeta lo dice: te van a deber tanto en el mes tal.</w:t>
+      </w:r>
+    </w:p>
+    <w:p>
+      <w:pPr>
+        <w:spacing w:after="80"/>
+      </w:pPr>
+      <w:r>
+        <w:t>Ese es el mes en que los proyectos se abandonan.</w:t>
       </w:r>
     </w:p>
     <w:p>
@@ -708,8 +1682,67 @@
       </w:r>
     </w:p>
     <w:p>
-      <w:r>
-        <w:t>Estas son las preguntas que cualquier jefe de área haría. ¿Va a terminar a tiempo? ¿El proveedor va a aguantar con su dinero? ¿Cuánto cuesta mantenerlo después? ¿Qué no está incluido? Y abajo, si pides cambios a medio camino, cuánto cuesta cada tipo. Aquí está lo que dije antes: con casi todo con inteligencia artificial y este equipo, una corrección menor lleva de una hora y media a cinco, no de dos a ocho, y la tabla muestra las horas y el dinero. Es la misma regla que usa la calculadora de cambios del proyecto.</w:t>
+      <w:pPr>
+        <w:spacing w:after="80"/>
+      </w:pPr>
+      <w:r>
+        <w:t>Estas son las preguntas que cualquier jefe de área haría.</w:t>
+      </w:r>
+    </w:p>
+    <w:p>
+      <w:pPr>
+        <w:spacing w:after="80"/>
+      </w:pPr>
+      <w:r>
+        <w:t>¿Va a terminar a tiempo?</w:t>
+      </w:r>
+    </w:p>
+    <w:p>
+      <w:pPr>
+        <w:spacing w:after="80"/>
+      </w:pPr>
+      <w:r>
+        <w:t>¿El proveedor va a aguantar con su dinero?</w:t>
+      </w:r>
+    </w:p>
+    <w:p>
+      <w:pPr>
+        <w:spacing w:after="80"/>
+      </w:pPr>
+      <w:r>
+        <w:t>¿Cuánto cuesta mantenerlo después?</w:t>
+      </w:r>
+    </w:p>
+    <w:p>
+      <w:pPr>
+        <w:spacing w:after="80"/>
+      </w:pPr>
+      <w:r>
+        <w:t>¿Qué no está incluido?</w:t>
+      </w:r>
+    </w:p>
+    <w:p>
+      <w:pPr>
+        <w:spacing w:after="80"/>
+      </w:pPr>
+      <w:r>
+        <w:t>Y abajo, si pides cambios a medio camino, cuánto cuesta cada tipo.</w:t>
+      </w:r>
+    </w:p>
+    <w:p>
+      <w:pPr>
+        <w:spacing w:after="80"/>
+      </w:pPr>
+      <w:r>
+        <w:t>Aquí está lo que dije antes: con casi todo con inteligencia artificial y este equipo, una corrección menor lleva de una hora y media a cinco, no de dos a ocho, y la tabla muestra las horas y el dinero.</w:t>
+      </w:r>
+    </w:p>
+    <w:p>
+      <w:pPr>
+        <w:spacing w:after="80"/>
+      </w:pPr>
+      <w:r>
+        <w:t>Es la misma regla que usa la calculadora de cambios del proyecto.</w:t>
       </w:r>
     </w:p>
     <w:p>
@@ -734,8 +1767,43 @@
       </w:r>
     </w:p>
     <w:p>
-      <w:r>
-        <w:t>El mismo cálculo se redacta distinto según quién lo lee. Este es el reporte para el Ayuntamiento. Contesta con veredicto: si va a terminar a tiempo, si el proveedor va a aguantar, qué método va a usar, cuánto cuesta cada cambio y qué no está incluido. Y trae una lista de qué exigir en el contrato. Se puede imprimir o guardar como PDF.</w:t>
+      <w:pPr>
+        <w:spacing w:after="80"/>
+      </w:pPr>
+      <w:r>
+        <w:t>El mismo cálculo se redacta distinto según quién lo lee.</w:t>
+      </w:r>
+    </w:p>
+    <w:p>
+      <w:pPr>
+        <w:spacing w:after="80"/>
+      </w:pPr>
+      <w:r>
+        <w:t>Este es el reporte para el Ayuntamiento.</w:t>
+      </w:r>
+    </w:p>
+    <w:p>
+      <w:pPr>
+        <w:spacing w:after="80"/>
+      </w:pPr>
+      <w:r>
+        <w:t>Contesta con veredicto: si va a terminar a tiempo, si el proveedor va a aguantar, qué método va a usar, cuánto cuesta cada cambio y qué no está incluido.</w:t>
+      </w:r>
+    </w:p>
+    <w:p>
+      <w:pPr>
+        <w:spacing w:after="80"/>
+      </w:pPr>
+      <w:r>
+        <w:t>Y trae una lista de qué exigir en el contrato.</w:t>
+      </w:r>
+    </w:p>
+    <w:p>
+      <w:pPr>
+        <w:spacing w:after="80"/>
+      </w:pPr>
+      <w:r>
+        <w:t>Se puede imprimir o guardar como PDF.</w:t>
       </w:r>
     </w:p>
     <w:p>
@@ -760,8 +1828,27 @@
       </w:r>
     </w:p>
     <w:p>
-      <w:r>
-        <w:t>Y este es el recuadro que ve el proveedor: cuál opción le conviene según su utilidad, su riesgo y su tiempo, con las razones. Incluye las opciones que se descartaron aunque fueran más baratas, y dice por qué. Cuando el proveedor elige, la decisión queda registrada con fecha y nombre, y el sistema guarda qué recomendaba en ese momento, para poder comparar después.</w:t>
+      <w:pPr>
+        <w:spacing w:after="80"/>
+      </w:pPr>
+      <w:r>
+        <w:t>Y este es el recuadro que ve el proveedor: cuál opción le conviene según su utilidad, su riesgo y su tiempo, con las razones.</w:t>
+      </w:r>
+    </w:p>
+    <w:p>
+      <w:pPr>
+        <w:spacing w:after="80"/>
+      </w:pPr>
+      <w:r>
+        <w:t>Incluye las opciones que se descartaron aunque fueran más baratas, y dice por qué.</w:t>
+      </w:r>
+    </w:p>
+    <w:p>
+      <w:pPr>
+        <w:spacing w:after="80"/>
+      </w:pPr>
+      <w:r>
+        <w:t>Cuando el proveedor elige, la decisión queda registrada con fecha y nombre, y el sistema guarda qué recomendaba en ese momento, para poder comparar después.</w:t>
       </w:r>
     </w:p>
     <w:p>
@@ -786,8 +1873,43 @@
       </w:r>
     </w:p>
     <w:p>
-      <w:r>
-        <w:t>Un sistema así solo sirve si se le puede creer. Esta pantalla muestra los sesenta y cuatro parámetros que usa el cálculo: cuotas del IMSS e INFONAVIT, impuesto sobre nómina, salario mínimo y UMA, IVA e ISR, los factores por forma de hacerlo, los precios de las herramientas y el tipo de cambio. Cada uno con su ley o su fuente, la dirección donde consultarlo y la fecha desde la que rige. Quien estima puede cambiar cualquier valor para sus propias estimaciones sin afectar a nadie más. Y cada estimación guarda una copia de los parámetros con que se calculó, para poder reproducirla meses después.</w:t>
+      <w:pPr>
+        <w:spacing w:after="80"/>
+      </w:pPr>
+      <w:r>
+        <w:t>Un sistema así solo sirve si se le puede creer.</w:t>
+      </w:r>
+    </w:p>
+    <w:p>
+      <w:pPr>
+        <w:spacing w:after="80"/>
+      </w:pPr>
+      <w:r>
+        <w:t>Esta pantalla muestra los sesenta y cuatro parámetros que usa el cálculo: cuotas del IMSS e INFONAVIT, impuesto sobre nómina, salario mínimo y UMA, IVA e ISR, los factores por forma de hacerlo, los precios de las herramientas y el tipo de cambio.</w:t>
+      </w:r>
+    </w:p>
+    <w:p>
+      <w:pPr>
+        <w:spacing w:after="80"/>
+      </w:pPr>
+      <w:r>
+        <w:t>Cada uno con su ley o su fuente, la dirección donde consultarlo y la fecha desde la que rige.</w:t>
+      </w:r>
+    </w:p>
+    <w:p>
+      <w:pPr>
+        <w:spacing w:after="80"/>
+      </w:pPr>
+      <w:r>
+        <w:t>Quien estima puede cambiar cualquier valor para sus propias estimaciones sin afectar a nadie más.</w:t>
+      </w:r>
+    </w:p>
+    <w:p>
+      <w:pPr>
+        <w:spacing w:after="80"/>
+      </w:pPr>
+      <w:r>
+        <w:t>Y cada estimación guarda una copia de los parámetros con que se calculó, para poder reproducirla meses después.</w:t>
       </w:r>
     </w:p>
     <w:p>
@@ -812,8 +1934,27 @@
       </w:r>
     </w:p>
     <w:p>
-      <w:r>
-        <w:t>El resultado se puede compartir con un enlace de solo lectura que no pide cuenta. El jefe de área se lo manda a su director, o el proveedor a su cliente, y ven lo mismo: las cuatro respuestas, las opciones, de dónde sale el número y las preguntas. Quien lo compartió puede quitar el enlace cuando quiera.</w:t>
+      <w:pPr>
+        <w:spacing w:after="80"/>
+      </w:pPr>
+      <w:r>
+        <w:t>El resultado se puede compartir con un enlace de solo lectura que no pide cuenta.</w:t>
+      </w:r>
+    </w:p>
+    <w:p>
+      <w:pPr>
+        <w:spacing w:after="80"/>
+      </w:pPr>
+      <w:r>
+        <w:t>El jefe de área se lo manda a su director, o el proveedor a su cliente, y ven lo mismo: las cuatro respuestas, las opciones, de dónde sale el número y las preguntas.</w:t>
+      </w:r>
+    </w:p>
+    <w:p>
+      <w:pPr>
+        <w:spacing w:after="80"/>
+      </w:pPr>
+      <w:r>
+        <w:t>Quien lo compartió puede quitar el enlace cuando quiera.</w:t>
       </w:r>
     </w:p>
     <w:p>
@@ -838,8 +1979,43 @@
       </w:r>
     </w:p>
     <w:p>
-      <w:r>
-        <w:t>Ahora lo que sigue, que es lo que le pido al seminario que revise. Al pie de cada resultado hay cuatro preguntas que se contestan en treinta segundos: qué tan creíble te pareció la cifra, del uno al cinco; cuánto pensabas antes de verla; con qué forma de hacerlo lo harías; y qué te faltó. Es anónima. Con eso puedo comparar lo que la gente esperaba contra lo que el sistema calculó, separado por lado: Ayuntamiento y proveedor. Y sin esperar a que un proyecto termine, porque eso puede tardar meses.</w:t>
+      <w:pPr>
+        <w:spacing w:after="80"/>
+      </w:pPr>
+      <w:r>
+        <w:t>Ahora lo que sigue, que es lo que le pido al seminario que revise.</w:t>
+      </w:r>
+    </w:p>
+    <w:p>
+      <w:pPr>
+        <w:spacing w:after="80"/>
+      </w:pPr>
+      <w:r>
+        <w:t>Al pie de cada resultado hay cuatro preguntas que se contestan en treinta segundos: qué tan creíble te pareció la cifra, del uno al cinco; cuánto pensabas antes de verla; con qué forma de hacerlo lo harías; y qué te faltó.</w:t>
+      </w:r>
+    </w:p>
+    <w:p>
+      <w:pPr>
+        <w:spacing w:after="80"/>
+      </w:pPr>
+      <w:r>
+        <w:t>Es anónima.</w:t>
+      </w:r>
+    </w:p>
+    <w:p>
+      <w:pPr>
+        <w:spacing w:after="80"/>
+      </w:pPr>
+      <w:r>
+        <w:t>Con eso puedo comparar lo que la gente esperaba contra lo que el sistema calculó, separado por lado: Ayuntamiento y proveedor.</w:t>
+      </w:r>
+    </w:p>
+    <w:p>
+      <w:pPr>
+        <w:spacing w:after="80"/>
+      </w:pPr>
+      <w:r>
+        <w:t>Y sin esperar a que un proyecto termine, porque eso puede tardar meses.</w:t>
       </w:r>
     </w:p>
     <w:p>
@@ -864,8 +2040,59 @@
       </w:r>
     </w:p>
     <w:p>
-      <w:r>
-        <w:t>Además de la encuesta, el sistema mide cosas sin preguntar. Cuánto tarda cada persona en llegar a su primera cifra. Cuántos empiezan y no terminan. Qué forma de hacerlo eligen. Y cuando un proyecto termina, se captura lo que costó de verdad. Con quince casos terminados, el sistema calcula solo las mismas métricas del artículo y da un veredicto sobre la hipótesis. Este es el panel del investigador, donde se ve todo eso.</w:t>
+      <w:pPr>
+        <w:spacing w:after="80"/>
+      </w:pPr>
+      <w:r>
+        <w:t>Además de la encuesta, el sistema mide cosas sin preguntar.</w:t>
+      </w:r>
+    </w:p>
+    <w:p>
+      <w:pPr>
+        <w:spacing w:after="80"/>
+      </w:pPr>
+      <w:r>
+        <w:t>Cuánto tarda cada persona en llegar a su primera cifra.</w:t>
+      </w:r>
+    </w:p>
+    <w:p>
+      <w:pPr>
+        <w:spacing w:after="80"/>
+      </w:pPr>
+      <w:r>
+        <w:t>Cuántos empiezan y no terminan.</w:t>
+      </w:r>
+    </w:p>
+    <w:p>
+      <w:pPr>
+        <w:spacing w:after="80"/>
+      </w:pPr>
+      <w:r>
+        <w:t>Qué forma de hacerlo eligen.</w:t>
+      </w:r>
+    </w:p>
+    <w:p>
+      <w:pPr>
+        <w:spacing w:after="80"/>
+      </w:pPr>
+      <w:r>
+        <w:t>Y cuando un proyecto termina, se captura lo que costó de verdad.</w:t>
+      </w:r>
+    </w:p>
+    <w:p>
+      <w:pPr>
+        <w:spacing w:after="80"/>
+      </w:pPr>
+      <w:r>
+        <w:t>Con quince casos terminados, el sistema calcula solo las mismas medidas del artículo y dice si la hipótesis se cumple o no.</w:t>
+      </w:r>
+    </w:p>
+    <w:p>
+      <w:pPr>
+        <w:spacing w:after="80"/>
+      </w:pPr>
+      <w:r>
+        <w:t>Este es el panel del investigador, donde se ve todo eso.</w:t>
       </w:r>
     </w:p>
     <w:p>
@@ -890,8 +2117,59 @@
       </w:r>
     </w:p>
     <w:p>
-      <w:r>
-        <w:t>El plan de validación es un piloto en dos olas. La primera, en octubre, con ayuntamientos: Fresnillo primero, y luego municipios cercanos a través de las redes que ya existen, como CIAPEM, que este año convocó un seminario sobre inteligencia artificial para gobiernos municipales. Cada persona usa el sistema treinta minutos con un proyecto real o con el ejemplo y contesta la encuesta. La segunda ola, en noviembre, con desarrolladores y empresas pequeñas: cotizan un proyecto real y me dicen si la cifra se acerca a lo que cobrarían. Y hay un dato que explica por qué hay espacio para esto. La identidad digital del gobierno federal está integrada en doscientos cuarenta y dos sistemas, y solo ocho son municipales, en un país con dos mil cuatrocientos sesenta y nueve municipios. Los municipios chicos compran software a proveedores chicos, y ninguno de los dos tiene con qué estimar.</w:t>
+      <w:pPr>
+        <w:spacing w:after="80"/>
+      </w:pPr>
+      <w:r>
+        <w:t>El plan de validación es un piloto en dos olas.</w:t>
+      </w:r>
+    </w:p>
+    <w:p>
+      <w:pPr>
+        <w:spacing w:after="80"/>
+      </w:pPr>
+      <w:r>
+        <w:t>La primera, en octubre, con ayuntamientos: Fresnillo primero, y luego municipios cercanos a través de las redes que ya existen, como CIAPEM, que este año convocó un seminario sobre inteligencia artificial para gobiernos municipales.</w:t>
+      </w:r>
+    </w:p>
+    <w:p>
+      <w:pPr>
+        <w:spacing w:after="80"/>
+      </w:pPr>
+      <w:r>
+        <w:t>Cada persona usa el sistema treinta minutos con un proyecto real o con el ejemplo y contesta la encuesta.</w:t>
+      </w:r>
+    </w:p>
+    <w:p>
+      <w:pPr>
+        <w:spacing w:after="80"/>
+      </w:pPr>
+      <w:r>
+        <w:t>La segunda ola, en noviembre, con desarrolladores y empresas pequeñas: cotizan un proyecto real y me dicen si la cifra se acerca a lo que cobrarían.</w:t>
+      </w:r>
+    </w:p>
+    <w:p>
+      <w:pPr>
+        <w:spacing w:after="80"/>
+      </w:pPr>
+      <w:r>
+        <w:t>Y hay un dato que explica por qué hay espacio para esto.</w:t>
+      </w:r>
+    </w:p>
+    <w:p>
+      <w:pPr>
+        <w:spacing w:after="80"/>
+      </w:pPr>
+      <w:r>
+        <w:t>La identidad digital del gobierno federal está integrada en doscientos cuarenta y dos sistemas, y solo ocho son municipales, en un país con dos mil cuatrocientos sesenta y nueve municipios.</w:t>
+      </w:r>
+    </w:p>
+    <w:p>
+      <w:pPr>
+        <w:spacing w:after="80"/>
+      </w:pPr>
+      <w:r>
+        <w:t>Los municipios chicos compran software a proveedores chicos, y ninguno de los dos tiene con qué estimar.</w:t>
       </w:r>
     </w:p>
     <w:p>
@@ -916,8 +2194,75 @@
       </w:r>
     </w:p>
     <w:p>
-      <w:r>
-        <w:t>Sobre el modelo, quiero ser honesto: no voy a decir hoy cuál es el modelo que lo va a predecir todo, porque no tengo los datos para decirlo. Hoy el motor no adivina: es una cuenta fija que cualquiera puede rehacer a mano, y eso es una virtud. Lo que sí está listo es el método para elegir el modelo cuando haya datos. Con quince casos terminados, el sistema entrena y compara tres modelos, con las variables del artículo más las que este año se volvieron indispensables: la forma de hacerlo, la pericia y el costo de las herramientas. Y da un veredicto con criterios que ya están fijados. La literatura de este año va por ahí. Un artículo de marzo dice que los modelos clásicos fallan por razones de fondo cuando quien escribe el código es una inteligencia artificial. Otro de agosto propone descomponer el costo en tres partes: lo que se paga a la inteligencia artificial por su uso, la supervisión humana y los servidores. Mi tesis entra ahí, con datos de ayuntamientos reales, que hoy no existen en ningún lado.</w:t>
+      <w:pPr>
+        <w:spacing w:after="80"/>
+      </w:pPr>
+      <w:r>
+        <w:t>Sobre el modelo, quiero ser honesto: no voy a decir hoy cuál es el modelo que lo va a predecir todo, porque no tengo los datos para decirlo.</w:t>
+      </w:r>
+    </w:p>
+    <w:p>
+      <w:pPr>
+        <w:spacing w:after="80"/>
+      </w:pPr>
+      <w:r>
+        <w:t>Hoy el motor no adivina: es una cuenta fija que cualquiera puede rehacer a mano, y eso es una virtud.</w:t>
+      </w:r>
+    </w:p>
+    <w:p>
+      <w:pPr>
+        <w:spacing w:after="80"/>
+      </w:pPr>
+      <w:r>
+        <w:t>Lo que sí está listo es el método para elegir el modelo cuando haya datos.</w:t>
+      </w:r>
+    </w:p>
+    <w:p>
+      <w:pPr>
+        <w:spacing w:after="80"/>
+      </w:pPr>
+      <w:r>
+        <w:t>Con quince casos terminados, el sistema entrena y compara tres modelos, con las variables del artículo más las que este año se volvieron indispensables: la forma de hacerlo, la pericia y el costo de las herramientas.</w:t>
+      </w:r>
+    </w:p>
+    <w:p>
+      <w:pPr>
+        <w:spacing w:after="80"/>
+      </w:pPr>
+      <w:r>
+        <w:t>Y da un veredicto con criterios que ya están fijados.</w:t>
+      </w:r>
+    </w:p>
+    <w:p>
+      <w:pPr>
+        <w:spacing w:after="80"/>
+      </w:pPr>
+      <w:r>
+        <w:t>La literatura de este año va por ahí.</w:t>
+      </w:r>
+    </w:p>
+    <w:p>
+      <w:pPr>
+        <w:spacing w:after="80"/>
+      </w:pPr>
+      <w:r>
+        <w:t>Un artículo de marzo dice que los modelos clásicos fallan por razones de fondo cuando quien escribe el código es una inteligencia artificial.</w:t>
+      </w:r>
+    </w:p>
+    <w:p>
+      <w:pPr>
+        <w:spacing w:after="80"/>
+      </w:pPr>
+      <w:r>
+        <w:t>Otro de agosto propone descomponer el costo en tres partes: lo que se paga a la inteligencia artificial por su uso, la supervisión humana y los servidores.</w:t>
+      </w:r>
+    </w:p>
+    <w:p>
+      <w:pPr>
+        <w:spacing w:after="80"/>
+      </w:pPr>
+      <w:r>
+        <w:t>Mi tesis entra ahí, con datos de ayuntamientos reales, que hoy no existen en ningún lado.</w:t>
       </w:r>
     </w:p>
     <w:p>
@@ -942,8 +2287,51 @@
       </w:r>
     </w:p>
     <w:p>
-      <w:r>
-        <w:t>Los límites, dichos de frente. Uno: todavía no hay casos reales terminados. Dos: los precios y los factores cambian mes con mes, y por eso son parámetros con fecha y no números fijos. Tres: el sistema estima, no dictamina; la parte fiscal y laboral la tiene que revisar un profesional, y el sistema lo dice. Cuatro: la encuesta la contesta quien quiere, así que contestan más los que ya están convencidos, y por eso también mido cosas sin preguntar. Y cinco: mucha de la evidencia de este año viene de empresas que venden estas herramientas; en la tesis separo lo que viene de estudios controlados de lo que viene de encuestas y folletos.</w:t>
+      <w:pPr>
+        <w:spacing w:after="80"/>
+      </w:pPr>
+      <w:r>
+        <w:t>Los límites, dichos de frente.</w:t>
+      </w:r>
+    </w:p>
+    <w:p>
+      <w:pPr>
+        <w:spacing w:after="80"/>
+      </w:pPr>
+      <w:r>
+        <w:t>Uno: todavía no hay casos reales terminados.</w:t>
+      </w:r>
+    </w:p>
+    <w:p>
+      <w:pPr>
+        <w:spacing w:after="80"/>
+      </w:pPr>
+      <w:r>
+        <w:t>Dos: los precios y los factores cambian mes con mes, y por eso son parámetros con fecha y no números fijos.</w:t>
+      </w:r>
+    </w:p>
+    <w:p>
+      <w:pPr>
+        <w:spacing w:after="80"/>
+      </w:pPr>
+      <w:r>
+        <w:t>Tres: el sistema estima, no dictamina; la parte fiscal y laboral la tiene que revisar un profesional, y el sistema lo dice.</w:t>
+      </w:r>
+    </w:p>
+    <w:p>
+      <w:pPr>
+        <w:spacing w:after="80"/>
+      </w:pPr>
+      <w:r>
+        <w:t>Cuatro: la encuesta la contesta quien quiere, así que contestan más los que ya están convencidos, y por eso también mido cosas sin preguntar.</w:t>
+      </w:r>
+    </w:p>
+    <w:p>
+      <w:pPr>
+        <w:spacing w:after="80"/>
+      </w:pPr>
+      <w:r>
+        <w:t>Y cinco: mucha de la evidencia de este año viene de empresas que venden estas herramientas; en la tesis separo lo que viene de estudios controlados de lo que viene de encuestas y folletos.</w:t>
       </w:r>
     </w:p>
     <w:p>
@@ -968,8 +2356,75 @@
       </w:r>
     </w:p>
     <w:p>
-      <w:r>
-        <w:t>El cronograma del semestre. Agosto: la radiografía de la tesis y la matriz de seguimiento, ya entregadas. Septiembre: el sistema con todo lo que acabo de mostrar, ya desplegado en el servidor. Octubre: la primera ola del piloto con ayuntamientos. Noviembre: la segunda ola con desarrolladores y el análisis. Diciembre: resultados y presentación final. Lo que no depende de mí es cuántos proyectos terminan dentro del semestre. Por eso el piloto mide cosas que sí puedo tener en estas fechas: credibilidad y tiempo a la primera cifra. La captura del resultado real queda sembrada para después.</w:t>
+      <w:pPr>
+        <w:spacing w:after="80"/>
+      </w:pPr>
+      <w:r>
+        <w:t>El cronograma del semestre.</w:t>
+      </w:r>
+    </w:p>
+    <w:p>
+      <w:pPr>
+        <w:spacing w:after="80"/>
+      </w:pPr>
+      <w:r>
+        <w:t>Agosto: la radiografía de la tesis y la matriz de seguimiento, ya entregadas.</w:t>
+      </w:r>
+    </w:p>
+    <w:p>
+      <w:pPr>
+        <w:spacing w:after="80"/>
+      </w:pPr>
+      <w:r>
+        <w:t>Septiembre: el sistema con todo lo que acabo de mostrar, ya desplegado en el servidor.</w:t>
+      </w:r>
+    </w:p>
+    <w:p>
+      <w:pPr>
+        <w:spacing w:after="80"/>
+      </w:pPr>
+      <w:r>
+        <w:t>Octubre: la primera ola del piloto con ayuntamientos.</w:t>
+      </w:r>
+    </w:p>
+    <w:p>
+      <w:pPr>
+        <w:spacing w:after="80"/>
+      </w:pPr>
+      <w:r>
+        <w:t>Noviembre: la segunda ola con desarrolladores y el análisis.</w:t>
+      </w:r>
+    </w:p>
+    <w:p>
+      <w:pPr>
+        <w:spacing w:after="80"/>
+      </w:pPr>
+      <w:r>
+        <w:t>Diciembre: resultados y presentación final.</w:t>
+      </w:r>
+    </w:p>
+    <w:p>
+      <w:pPr>
+        <w:spacing w:after="80"/>
+      </w:pPr>
+      <w:r>
+        <w:t>Lo que no depende de mí es cuántos proyectos terminan dentro del semestre.</w:t>
+      </w:r>
+    </w:p>
+    <w:p>
+      <w:pPr>
+        <w:spacing w:after="80"/>
+      </w:pPr>
+      <w:r>
+        <w:t>Por eso el piloto mide cosas que sí puedo tener en estas fechas: credibilidad y tiempo a la primera cifra.</w:t>
+      </w:r>
+    </w:p>
+    <w:p>
+      <w:pPr>
+        <w:spacing w:after="80"/>
+      </w:pPr>
+      <w:r>
+        <w:t>La captura del resultado real queda sembrada para después.</w:t>
       </w:r>
     </w:p>
     <w:p>
@@ -990,12 +2445,63 @@
     </w:p>
     <w:p>
       <w:r>
-        <w:t>Dura aproximadamente 0.7 minutos.</w:t>
-      </w:r>
-    </w:p>
-    <w:p>
-      <w:r>
-        <w:t>Cierro con lo que pido. Al jurado, su opinión sobre el instrumento del piloto: las cuatro preguntas, las métricas y el umbral de quince casos. A los ayuntamientos, treinta minutos para probarlo con un proyecto real, sin cuenta y sin instalar nada. A los proveedores, cotizar un proyecto real y decirme si la cifra se acerca a lo que cobrarían. La tesis parte de una idea sencilla: los tiempos ya cambiaron, y el que cotiza como antes, o compra como antes, va a perder. Este sistema es una forma de que los dos lados de la mesa vean el mismo número, con todo lo que trae adentro, antes de firmar. Gracias.</w:t>
+        <w:t>Dura aproximadamente 0.8 minutos.</w:t>
+      </w:r>
+    </w:p>
+    <w:p>
+      <w:pPr>
+        <w:spacing w:after="80"/>
+      </w:pPr>
+      <w:r>
+        <w:t>Cierro con lo que pido.</w:t>
+      </w:r>
+    </w:p>
+    <w:p>
+      <w:pPr>
+        <w:spacing w:after="80"/>
+      </w:pPr>
+      <w:r>
+        <w:t>Al jurado, su opinión sobre la encuesta del piloto: las cuatro preguntas, lo que se mide sin preguntar y la regla de esperar quince casos terminados.</w:t>
+      </w:r>
+    </w:p>
+    <w:p>
+      <w:pPr>
+        <w:spacing w:after="80"/>
+      </w:pPr>
+      <w:r>
+        <w:t>A los ayuntamientos, treinta minutos para probarlo con un proyecto real, sin cuenta y sin instalar nada.</w:t>
+      </w:r>
+    </w:p>
+    <w:p>
+      <w:pPr>
+        <w:spacing w:after="80"/>
+      </w:pPr>
+      <w:r>
+        <w:t>A los proveedores, cotizar un proyecto real y decirme si la cifra se acerca a lo que cobrarían.</w:t>
+      </w:r>
+    </w:p>
+    <w:p>
+      <w:pPr>
+        <w:spacing w:after="80"/>
+      </w:pPr>
+      <w:r>
+        <w:t>La tesis parte de una idea sencilla: los tiempos ya cambiaron, y el que cotiza como antes, o compra como antes, va a perder.</w:t>
+      </w:r>
+    </w:p>
+    <w:p>
+      <w:pPr>
+        <w:spacing w:after="80"/>
+      </w:pPr>
+      <w:r>
+        <w:t>Este sistema es una forma de que los dos lados de la mesa vean el mismo número, con todo lo que trae adentro, antes de firmar.</w:t>
+      </w:r>
+    </w:p>
+    <w:p>
+      <w:pPr>
+        <w:spacing w:after="80"/>
+      </w:pPr>
+      <w:r>
+        <w:t>Gracias.</w:t>
       </w:r>
     </w:p>
     <w:p>
@@ -1020,6 +2526,9 @@
       </w:r>
     </w:p>
     <w:p>
+      <w:pPr>
+        <w:spacing w:after="80"/>
+      </w:pPr>
       <w:r>
         <w:t>No se lee en voz alta; se deja en pantalla unos segundos.</w:t>
       </w:r>
@@ -1046,6 +2555,9 @@
       </w:r>
     </w:p>
     <w:p>
+      <w:pPr>
+        <w:spacing w:after="80"/>
+      </w:pPr>
       <w:r>
         <w:t>No se lee en voz alta; se deja en pantalla unos segundos.</w:t>
       </w:r>

</xml_diff>